<commit_message>
chore: add link repo for document
</commit_message>
<xml_diff>
--- a/TranTuanHung_23659581_Week_4/TranTuanHung_23659581.docx
+++ b/TranTuanHung_23659581_Week_4/TranTuanHung_23659581.docx
@@ -59,6 +59,17 @@
       </w:r>
       <w:r>
         <w:t xml:space="preserve">: </w:t>
+      </w:r>
+      <w:hyperlink r:id="rId6" w:history="1">
+        <w:r>
+          <w:rPr>
+            <w:rStyle w:val="Hyperlink"/>
+          </w:rPr>
+          <w:t>https://github.com/trantuanhung1209/React_Native_Lab/tree/main/TranTuanHung_23659581_Week_4</w:t>
+        </w:r>
+      </w:hyperlink>
+      <w:r>
+        <w:t xml:space="preserve"> </w:t>
       </w:r>
     </w:p>
     <w:tbl>
@@ -169,48 +180,6 @@
                     <pic:cNvPicPr/>
                   </pic:nvPicPr>
                   <pic:blipFill>
-                    <a:blip r:embed="rId6"/>
-                    <a:stretch>
-                      <a:fillRect/>
-                    </a:stretch>
-                  </pic:blipFill>
-                  <pic:spPr>
-                    <a:xfrm>
-                      <a:off x="0" y="0"/>
-                      <a:ext cx="6189345" cy="3481070"/>
-                    </a:xfrm>
-                    <a:prstGeom prst="rect">
-                      <a:avLst/>
-                    </a:prstGeom>
-                  </pic:spPr>
-                </pic:pic>
-              </a:graphicData>
-            </a:graphic>
-          </wp:inline>
-        </w:drawing>
-      </w:r>
-    </w:p>
-    <w:p>
-      <w:pPr>
-        <w:spacing w:after="120"/>
-      </w:pPr>
-      <w:r>
-        <w:drawing>
-          <wp:inline distT="0" distB="0" distL="0" distR="0" wp14:anchorId="63AF97A3" wp14:editId="25C6C29D">
-            <wp:extent cx="6189345" cy="3481070"/>
-            <wp:effectExtent l="0" t="0" r="1905" b="5080"/>
-            <wp:docPr id="376217877" name="Picture 1"/>
-            <wp:cNvGraphicFramePr>
-              <a:graphicFrameLocks xmlns:a="http://schemas.openxmlformats.org/drawingml/2006/main" noChangeAspect="1"/>
-            </wp:cNvGraphicFramePr>
-            <a:graphic xmlns:a="http://schemas.openxmlformats.org/drawingml/2006/main">
-              <a:graphicData uri="http://schemas.openxmlformats.org/drawingml/2006/picture">
-                <pic:pic xmlns:pic="http://schemas.openxmlformats.org/drawingml/2006/picture">
-                  <pic:nvPicPr>
-                    <pic:cNvPr id="376217877" name=""/>
-                    <pic:cNvPicPr/>
-                  </pic:nvPicPr>
-                  <pic:blipFill>
                     <a:blip r:embed="rId7"/>
                     <a:stretch>
                       <a:fillRect/>
@@ -237,12 +206,11 @@
         <w:spacing w:after="120"/>
       </w:pPr>
       <w:r>
-        <w:lastRenderedPageBreak/>
         <w:drawing>
-          <wp:inline distT="0" distB="0" distL="0" distR="0" wp14:anchorId="4092FA00" wp14:editId="78C5570C">
+          <wp:inline distT="0" distB="0" distL="0" distR="0" wp14:anchorId="63AF97A3" wp14:editId="25C6C29D">
             <wp:extent cx="6189345" cy="3481070"/>
             <wp:effectExtent l="0" t="0" r="1905" b="5080"/>
-            <wp:docPr id="1195523892" name="Picture 1"/>
+            <wp:docPr id="376217877" name="Picture 1"/>
             <wp:cNvGraphicFramePr>
               <a:graphicFrameLocks xmlns:a="http://schemas.openxmlformats.org/drawingml/2006/main" noChangeAspect="1"/>
             </wp:cNvGraphicFramePr>
@@ -250,7 +218,7 @@
               <a:graphicData uri="http://schemas.openxmlformats.org/drawingml/2006/picture">
                 <pic:pic xmlns:pic="http://schemas.openxmlformats.org/drawingml/2006/picture">
                   <pic:nvPicPr>
-                    <pic:cNvPr id="1195523892" name=""/>
+                    <pic:cNvPr id="376217877" name=""/>
                     <pic:cNvPicPr/>
                   </pic:nvPicPr>
                   <pic:blipFill>
@@ -280,11 +248,12 @@
         <w:spacing w:after="120"/>
       </w:pPr>
       <w:r>
+        <w:lastRenderedPageBreak/>
         <w:drawing>
-          <wp:inline distT="0" distB="0" distL="0" distR="0" wp14:anchorId="1CC009A6" wp14:editId="2F1B921D">
+          <wp:inline distT="0" distB="0" distL="0" distR="0" wp14:anchorId="4092FA00" wp14:editId="78C5570C">
             <wp:extent cx="6189345" cy="3481070"/>
             <wp:effectExtent l="0" t="0" r="1905" b="5080"/>
-            <wp:docPr id="243750956" name="Picture 1"/>
+            <wp:docPr id="1195523892" name="Picture 1"/>
             <wp:cNvGraphicFramePr>
               <a:graphicFrameLocks xmlns:a="http://schemas.openxmlformats.org/drawingml/2006/main" noChangeAspect="1"/>
             </wp:cNvGraphicFramePr>
@@ -292,7 +261,7 @@
               <a:graphicData uri="http://schemas.openxmlformats.org/drawingml/2006/picture">
                 <pic:pic xmlns:pic="http://schemas.openxmlformats.org/drawingml/2006/picture">
                   <pic:nvPicPr>
-                    <pic:cNvPr id="243750956" name=""/>
+                    <pic:cNvPr id="1195523892" name=""/>
                     <pic:cNvPicPr/>
                   </pic:nvPicPr>
                   <pic:blipFill>
@@ -319,6 +288,48 @@
     </w:p>
     <w:p>
       <w:pPr>
+        <w:spacing w:after="120"/>
+      </w:pPr>
+      <w:r>
+        <w:drawing>
+          <wp:inline distT="0" distB="0" distL="0" distR="0" wp14:anchorId="1CC009A6" wp14:editId="2F1B921D">
+            <wp:extent cx="6189345" cy="3481070"/>
+            <wp:effectExtent l="0" t="0" r="1905" b="5080"/>
+            <wp:docPr id="243750956" name="Picture 1"/>
+            <wp:cNvGraphicFramePr>
+              <a:graphicFrameLocks xmlns:a="http://schemas.openxmlformats.org/drawingml/2006/main" noChangeAspect="1"/>
+            </wp:cNvGraphicFramePr>
+            <a:graphic xmlns:a="http://schemas.openxmlformats.org/drawingml/2006/main">
+              <a:graphicData uri="http://schemas.openxmlformats.org/drawingml/2006/picture">
+                <pic:pic xmlns:pic="http://schemas.openxmlformats.org/drawingml/2006/picture">
+                  <pic:nvPicPr>
+                    <pic:cNvPr id="243750956" name=""/>
+                    <pic:cNvPicPr/>
+                  </pic:nvPicPr>
+                  <pic:blipFill>
+                    <a:blip r:embed="rId10"/>
+                    <a:stretch>
+                      <a:fillRect/>
+                    </a:stretch>
+                  </pic:blipFill>
+                  <pic:spPr>
+                    <a:xfrm>
+                      <a:off x="0" y="0"/>
+                      <a:ext cx="6189345" cy="3481070"/>
+                    </a:xfrm>
+                    <a:prstGeom prst="rect">
+                      <a:avLst/>
+                    </a:prstGeom>
+                  </pic:spPr>
+                </pic:pic>
+              </a:graphicData>
+            </a:graphic>
+          </wp:inline>
+        </w:drawing>
+      </w:r>
+    </w:p>
+    <w:p>
+      <w:pPr>
         <w:spacing w:before="80" w:after="120"/>
         <w:jc w:val="center"/>
       </w:pPr>
@@ -340,7 +351,7 @@
                     <pic:cNvPicPr/>
                   </pic:nvPicPr>
                   <pic:blipFill>
-                    <a:blip r:embed="rId10"/>
+                    <a:blip r:embed="rId11"/>
                     <a:stretch>
                       <a:fillRect/>
                     </a:stretch>
@@ -558,7 +569,7 @@
                     <pic:cNvPicPr/>
                   </pic:nvPicPr>
                   <pic:blipFill>
-                    <a:blip r:embed="rId11"/>
+                    <a:blip r:embed="rId12"/>
                     <a:stretch>
                       <a:fillRect/>
                     </a:stretch>
@@ -604,49 +615,6 @@
                 <pic:pic xmlns:pic="http://schemas.openxmlformats.org/drawingml/2006/picture">
                   <pic:nvPicPr>
                     <pic:cNvPr id="1425185638" name=""/>
-                    <pic:cNvPicPr/>
-                  </pic:nvPicPr>
-                  <pic:blipFill>
-                    <a:blip r:embed="rId12"/>
-                    <a:stretch>
-                      <a:fillRect/>
-                    </a:stretch>
-                  </pic:blipFill>
-                  <pic:spPr>
-                    <a:xfrm>
-                      <a:off x="0" y="0"/>
-                      <a:ext cx="6189345" cy="3481070"/>
-                    </a:xfrm>
-                    <a:prstGeom prst="rect">
-                      <a:avLst/>
-                    </a:prstGeom>
-                  </pic:spPr>
-                </pic:pic>
-              </a:graphicData>
-            </a:graphic>
-          </wp:inline>
-        </w:drawing>
-      </w:r>
-    </w:p>
-    <w:p>
-      <w:pPr>
-        <w:spacing w:before="80" w:after="120"/>
-        <w:jc w:val="center"/>
-      </w:pPr>
-      <w:r>
-        <w:drawing>
-          <wp:inline distT="0" distB="0" distL="0" distR="0" wp14:anchorId="2261720D" wp14:editId="2E1E3FFE">
-            <wp:extent cx="6189345" cy="3481070"/>
-            <wp:effectExtent l="0" t="0" r="1905" b="5080"/>
-            <wp:docPr id="181812346" name="Picture 1"/>
-            <wp:cNvGraphicFramePr>
-              <a:graphicFrameLocks xmlns:a="http://schemas.openxmlformats.org/drawingml/2006/main" noChangeAspect="1"/>
-            </wp:cNvGraphicFramePr>
-            <a:graphic xmlns:a="http://schemas.openxmlformats.org/drawingml/2006/main">
-              <a:graphicData uri="http://schemas.openxmlformats.org/drawingml/2006/picture">
-                <pic:pic xmlns:pic="http://schemas.openxmlformats.org/drawingml/2006/picture">
-                  <pic:nvPicPr>
-                    <pic:cNvPr id="181812346" name=""/>
                     <pic:cNvPicPr/>
                   </pic:nvPicPr>
                   <pic:blipFill>
@@ -677,6 +645,49 @@
         <w:jc w:val="center"/>
       </w:pPr>
       <w:r>
+        <w:drawing>
+          <wp:inline distT="0" distB="0" distL="0" distR="0" wp14:anchorId="2261720D" wp14:editId="2E1E3FFE">
+            <wp:extent cx="6189345" cy="3481070"/>
+            <wp:effectExtent l="0" t="0" r="1905" b="5080"/>
+            <wp:docPr id="181812346" name="Picture 1"/>
+            <wp:cNvGraphicFramePr>
+              <a:graphicFrameLocks xmlns:a="http://schemas.openxmlformats.org/drawingml/2006/main" noChangeAspect="1"/>
+            </wp:cNvGraphicFramePr>
+            <a:graphic xmlns:a="http://schemas.openxmlformats.org/drawingml/2006/main">
+              <a:graphicData uri="http://schemas.openxmlformats.org/drawingml/2006/picture">
+                <pic:pic xmlns:pic="http://schemas.openxmlformats.org/drawingml/2006/picture">
+                  <pic:nvPicPr>
+                    <pic:cNvPr id="181812346" name=""/>
+                    <pic:cNvPicPr/>
+                  </pic:nvPicPr>
+                  <pic:blipFill>
+                    <a:blip r:embed="rId14"/>
+                    <a:stretch>
+                      <a:fillRect/>
+                    </a:stretch>
+                  </pic:blipFill>
+                  <pic:spPr>
+                    <a:xfrm>
+                      <a:off x="0" y="0"/>
+                      <a:ext cx="6189345" cy="3481070"/>
+                    </a:xfrm>
+                    <a:prstGeom prst="rect">
+                      <a:avLst/>
+                    </a:prstGeom>
+                  </pic:spPr>
+                </pic:pic>
+              </a:graphicData>
+            </a:graphic>
+          </wp:inline>
+        </w:drawing>
+      </w:r>
+    </w:p>
+    <w:p>
+      <w:pPr>
+        <w:spacing w:before="80" w:after="120"/>
+        <w:jc w:val="center"/>
+      </w:pPr>
+      <w:r>
         <w:lastRenderedPageBreak/>
         <w:drawing>
           <wp:inline distT="0" distB="0" distL="0" distR="0" wp14:anchorId="7AECCDFD" wp14:editId="3D45B730">
@@ -694,7 +705,7 @@
                     <pic:cNvPicPr/>
                   </pic:nvPicPr>
                   <pic:blipFill>
-                    <a:blip r:embed="rId14"/>
+                    <a:blip r:embed="rId15"/>
                     <a:stretch>
                       <a:fillRect/>
                     </a:stretch>
@@ -956,7 +967,7 @@
                     <pic:cNvPicPr preferRelativeResize="0"/>
                   </pic:nvPicPr>
                   <pic:blipFill>
-                    <a:blip r:embed="rId15"/>
+                    <a:blip r:embed="rId16"/>
                     <a:srcRect/>
                     <a:stretch>
                       <a:fillRect/>
@@ -1002,7 +1013,7 @@
                     <pic:cNvPicPr/>
                   </pic:nvPicPr>
                   <pic:blipFill>
-                    <a:blip r:embed="rId16"/>
+                    <a:blip r:embed="rId17"/>
                     <a:stretch>
                       <a:fillRect/>
                     </a:stretch>
@@ -1045,7 +1056,7 @@
                     <pic:cNvPicPr/>
                   </pic:nvPicPr>
                   <pic:blipFill>
-                    <a:blip r:embed="rId17"/>
+                    <a:blip r:embed="rId18"/>
                     <a:stretch>
                       <a:fillRect/>
                     </a:stretch>
@@ -1253,7 +1264,7 @@
                     <pic:cNvPicPr preferRelativeResize="0"/>
                   </pic:nvPicPr>
                   <pic:blipFill>
-                    <a:blip r:embed="rId18"/>
+                    <a:blip r:embed="rId19"/>
                     <a:srcRect/>
                     <a:stretch>
                       <a:fillRect/>
@@ -1298,7 +1309,7 @@
                     <pic:cNvPicPr/>
                   </pic:nvPicPr>
                   <pic:blipFill>
-                    <a:blip r:embed="rId19"/>
+                    <a:blip r:embed="rId20"/>
                     <a:stretch>
                       <a:fillRect/>
                     </a:stretch>
@@ -1342,7 +1353,7 @@
                     <pic:cNvPicPr/>
                   </pic:nvPicPr>
                   <pic:blipFill>
-                    <a:blip r:embed="rId20"/>
+                    <a:blip r:embed="rId21"/>
                     <a:stretch>
                       <a:fillRect/>
                     </a:stretch>
@@ -1385,7 +1396,7 @@
                     <pic:cNvPicPr/>
                   </pic:nvPicPr>
                   <pic:blipFill>
-                    <a:blip r:embed="rId21"/>
+                    <a:blip r:embed="rId22"/>
                     <a:stretch>
                       <a:fillRect/>
                     </a:stretch>
@@ -2423,6 +2434,18 @@
       </w:tblCellMar>
     </w:tblPr>
   </w:style>
+  <w:style w:type="character" w:styleId="UnresolvedMention">
+    <w:name w:val="Unresolved Mention"/>
+    <w:basedOn w:val="DefaultParagraphFont"/>
+    <w:uiPriority w:val="99"/>
+    <w:semiHidden/>
+    <w:unhideWhenUsed/>
+    <w:rsid w:val="00A71C8C"/>
+    <w:rPr>
+      <w:color w:val="605E5C"/>
+      <w:shd w:val="clear" w:color="auto" w:fill="E1DFDD"/>
+    </w:rPr>
+  </w:style>
 </w:styles>
 </file>
 

</xml_diff>